<commit_message>
Ajout des algorigrammes de chaque exercice dans le fichier réponse
Co-Authored-By: Claude Opus 5.5 <noreply@anthropic.com>
Claude-Session: https://claude.ai/code/session_017gKy6rXX5gzTzabia7tzZN
</commit_message>
<xml_diff>
--- a/TP1_Python/TP_ALGOE3_R2026_G1_nom1_nom2.docx
+++ b/TP1_Python/TP_ALGOE3_R2026_G1_nom1_nom2.docx
@@ -16,11 +16,62 @@
       </w:r>
     </w:p>
     <w:p>
+      <w:r>
+        <w:t>Légende des algorigrammes : rectangle vert = Début/Fin, rectangle bleu = instruction (déclaration, saisie « ← », calcul, affichage), losange jaune = test (oui / non), rectangle violet à doubles bords = sous-programme.</w:t>
+      </w:r>
+    </w:p>
+    <w:p>
       <w:pPr>
         <w:pStyle w:val="Heading1"/>
       </w:pPr>
       <w:r>
         <w:t>Exercice 10 – Moyenne de 3 valeurs</w:t>
+      </w:r>
+    </w:p>
+    <w:p>
+      <w:r>
+        <w:t>Algorigramme :</w:t>
+      </w:r>
+    </w:p>
+    <w:p>
+      <w:r>
+        <w:drawing>
+          <wp:inline xmlns:a="http://schemas.openxmlformats.org/drawingml/2006/main" xmlns:pic="http://schemas.openxmlformats.org/drawingml/2006/picture">
+            <wp:extent cx="4422601" cy="7920000"/>
+            <wp:docPr id="1" name="Picture 1"/>
+            <wp:cNvGraphicFramePr>
+              <a:graphicFrameLocks noChangeAspect="1"/>
+            </wp:cNvGraphicFramePr>
+            <a:graphic>
+              <a:graphicData uri="http://schemas.openxmlformats.org/drawingml/2006/picture">
+                <pic:pic>
+                  <pic:nvPicPr>
+                    <pic:cNvPr id="0" name="exo10.png"/>
+                    <pic:cNvPicPr/>
+                  </pic:nvPicPr>
+                  <pic:blipFill>
+                    <a:blip r:embed="rId9"/>
+                    <a:stretch>
+                      <a:fillRect/>
+                    </a:stretch>
+                  </pic:blipFill>
+                  <pic:spPr>
+                    <a:xfrm>
+                      <a:off x="0" y="0"/>
+                      <a:ext cx="4422601" cy="7920000"/>
+                    </a:xfrm>
+                    <a:prstGeom prst="rect"/>
+                  </pic:spPr>
+                </pic:pic>
+              </a:graphicData>
+            </a:graphic>
+          </wp:inline>
+        </w:drawing>
+      </w:r>
+    </w:p>
+    <w:p>
+      <w:r>
+        <w:t>Code source Python :</w:t>
       </w:r>
     </w:p>
     <w:p>
@@ -49,11 +100,62 @@
       </w:r>
     </w:p>
     <w:p>
+      <w:r>
+        <w:br w:type="page"/>
+      </w:r>
+    </w:p>
+    <w:p>
       <w:pPr>
         <w:pStyle w:val="Heading1"/>
       </w:pPr>
       <w:r>
         <w:t>Exercice 11 – Aire du rectangle</w:t>
+      </w:r>
+    </w:p>
+    <w:p>
+      <w:r>
+        <w:t>Algorigramme :</w:t>
+      </w:r>
+    </w:p>
+    <w:p>
+      <w:r>
+        <w:drawing>
+          <wp:inline xmlns:a="http://schemas.openxmlformats.org/drawingml/2006/main" xmlns:pic="http://schemas.openxmlformats.org/drawingml/2006/picture">
+            <wp:extent cx="3392424" cy="4722876"/>
+            <wp:docPr id="2" name="Picture 2"/>
+            <wp:cNvGraphicFramePr>
+              <a:graphicFrameLocks noChangeAspect="1"/>
+            </wp:cNvGraphicFramePr>
+            <a:graphic>
+              <a:graphicData uri="http://schemas.openxmlformats.org/drawingml/2006/picture">
+                <pic:pic>
+                  <pic:nvPicPr>
+                    <pic:cNvPr id="0" name="exo11.png"/>
+                    <pic:cNvPicPr/>
+                  </pic:nvPicPr>
+                  <pic:blipFill>
+                    <a:blip r:embed="rId10"/>
+                    <a:stretch>
+                      <a:fillRect/>
+                    </a:stretch>
+                  </pic:blipFill>
+                  <pic:spPr>
+                    <a:xfrm>
+                      <a:off x="0" y="0"/>
+                      <a:ext cx="3392424" cy="4722876"/>
+                    </a:xfrm>
+                    <a:prstGeom prst="rect"/>
+                  </pic:spPr>
+                </pic:pic>
+              </a:graphicData>
+            </a:graphic>
+          </wp:inline>
+        </w:drawing>
+      </w:r>
+    </w:p>
+    <w:p>
+      <w:r>
+        <w:t>Code source Python :</w:t>
       </w:r>
     </w:p>
     <w:p>
@@ -78,11 +180,62 @@
       </w:r>
     </w:p>
     <w:p>
+      <w:r>
+        <w:br w:type="page"/>
+      </w:r>
+    </w:p>
+    <w:p>
       <w:pPr>
         <w:pStyle w:val="Heading1"/>
       </w:pPr>
       <w:r>
         <w:t>Exercice 12 – Admission</w:t>
+      </w:r>
+    </w:p>
+    <w:p>
+      <w:r>
+        <w:t>Algorigramme :</w:t>
+      </w:r>
+    </w:p>
+    <w:p>
+      <w:r>
+        <w:drawing>
+          <wp:inline xmlns:a="http://schemas.openxmlformats.org/drawingml/2006/main" xmlns:pic="http://schemas.openxmlformats.org/drawingml/2006/picture">
+            <wp:extent cx="4334256" cy="5047488"/>
+            <wp:docPr id="3" name="Picture 3"/>
+            <wp:cNvGraphicFramePr>
+              <a:graphicFrameLocks noChangeAspect="1"/>
+            </wp:cNvGraphicFramePr>
+            <a:graphic>
+              <a:graphicData uri="http://schemas.openxmlformats.org/drawingml/2006/picture">
+                <pic:pic>
+                  <pic:nvPicPr>
+                    <pic:cNvPr id="0" name="exo12.png"/>
+                    <pic:cNvPicPr/>
+                  </pic:nvPicPr>
+                  <pic:blipFill>
+                    <a:blip r:embed="rId11"/>
+                    <a:stretch>
+                      <a:fillRect/>
+                    </a:stretch>
+                  </pic:blipFill>
+                  <pic:spPr>
+                    <a:xfrm>
+                      <a:off x="0" y="0"/>
+                      <a:ext cx="4334256" cy="5047488"/>
+                    </a:xfrm>
+                    <a:prstGeom prst="rect"/>
+                  </pic:spPr>
+                </pic:pic>
+              </a:graphicData>
+            </a:graphic>
+          </wp:inline>
+        </w:drawing>
+      </w:r>
+    </w:p>
+    <w:p>
+      <w:r>
+        <w:t>Code source Python :</w:t>
       </w:r>
     </w:p>
     <w:p>
@@ -111,11 +264,62 @@
       </w:r>
     </w:p>
     <w:p>
+      <w:r>
+        <w:br w:type="page"/>
+      </w:r>
+    </w:p>
+    <w:p>
       <w:pPr>
         <w:pStyle w:val="Heading1"/>
       </w:pPr>
       <w:r>
         <w:t>Exercice 13 – Assurances</w:t>
+      </w:r>
+    </w:p>
+    <w:p>
+      <w:r>
+        <w:t>Algorigramme :</w:t>
+      </w:r>
+    </w:p>
+    <w:p>
+      <w:r>
+        <w:drawing>
+          <wp:inline xmlns:a="http://schemas.openxmlformats.org/drawingml/2006/main" xmlns:pic="http://schemas.openxmlformats.org/drawingml/2006/picture">
+            <wp:extent cx="5170932" cy="6455664"/>
+            <wp:docPr id="4" name="Picture 4"/>
+            <wp:cNvGraphicFramePr>
+              <a:graphicFrameLocks noChangeAspect="1"/>
+            </wp:cNvGraphicFramePr>
+            <a:graphic>
+              <a:graphicData uri="http://schemas.openxmlformats.org/drawingml/2006/picture">
+                <pic:pic>
+                  <pic:nvPicPr>
+                    <pic:cNvPr id="0" name="exo13.png"/>
+                    <pic:cNvPicPr/>
+                  </pic:nvPicPr>
+                  <pic:blipFill>
+                    <a:blip r:embed="rId12"/>
+                    <a:stretch>
+                      <a:fillRect/>
+                    </a:stretch>
+                  </pic:blipFill>
+                  <pic:spPr>
+                    <a:xfrm>
+                      <a:off x="0" y="0"/>
+                      <a:ext cx="5170932" cy="6455664"/>
+                    </a:xfrm>
+                    <a:prstGeom prst="rect"/>
+                  </pic:spPr>
+                </pic:pic>
+              </a:graphicData>
+            </a:graphic>
+          </wp:inline>
+        </w:drawing>
+      </w:r>
+    </w:p>
+    <w:p>
+      <w:r>
+        <w:t>Code source Python :</w:t>
       </w:r>
     </w:p>
     <w:p>
@@ -144,11 +348,62 @@
       </w:r>
     </w:p>
     <w:p>
+      <w:r>
+        <w:br w:type="page"/>
+      </w:r>
+    </w:p>
+    <w:p>
       <w:pPr>
         <w:pStyle w:val="Heading1"/>
       </w:pPr>
       <w:r>
         <w:t>Exercice 14 – Table de multiplication</w:t>
+      </w:r>
+    </w:p>
+    <w:p>
+      <w:r>
+        <w:t>Algorigramme :</w:t>
+      </w:r>
+    </w:p>
+    <w:p>
+      <w:r>
+        <w:drawing>
+          <wp:inline xmlns:a="http://schemas.openxmlformats.org/drawingml/2006/main" xmlns:pic="http://schemas.openxmlformats.org/drawingml/2006/picture">
+            <wp:extent cx="4035979" cy="7920000"/>
+            <wp:docPr id="5" name="Picture 5"/>
+            <wp:cNvGraphicFramePr>
+              <a:graphicFrameLocks noChangeAspect="1"/>
+            </wp:cNvGraphicFramePr>
+            <a:graphic>
+              <a:graphicData uri="http://schemas.openxmlformats.org/drawingml/2006/picture">
+                <pic:pic>
+                  <pic:nvPicPr>
+                    <pic:cNvPr id="0" name="exo14.png"/>
+                    <pic:cNvPicPr/>
+                  </pic:nvPicPr>
+                  <pic:blipFill>
+                    <a:blip r:embed="rId13"/>
+                    <a:stretch>
+                      <a:fillRect/>
+                    </a:stretch>
+                  </pic:blipFill>
+                  <pic:spPr>
+                    <a:xfrm>
+                      <a:off x="0" y="0"/>
+                      <a:ext cx="4035979" cy="7920000"/>
+                    </a:xfrm>
+                    <a:prstGeom prst="rect"/>
+                  </pic:spPr>
+                </pic:pic>
+              </a:graphicData>
+            </a:graphic>
+          </wp:inline>
+        </w:drawing>
+      </w:r>
+    </w:p>
+    <w:p>
+      <w:r>
+        <w:t>Code source Python :</w:t>
       </w:r>
     </w:p>
     <w:p>
@@ -169,6 +424,11 @@
       </w:r>
     </w:p>
     <w:p>
+      <w:r>
+        <w:br w:type="page"/>
+      </w:r>
+    </w:p>
+    <w:p>
       <w:pPr>
         <w:pStyle w:val="Heading1"/>
       </w:pPr>
@@ -178,36 +438,43 @@
     </w:p>
     <w:p>
       <w:r>
-        <w:t>Algorigramme (légende : (  ) début/fin, /  / entrée-sortie, [  ] traitement, &lt;  &gt; test, [[  ]] sous-programme) :</w:t>
+        <w:t>Algorigramme :</w:t>
       </w:r>
     </w:p>
     <w:p>
       <w:r>
-        <w:rPr>
-          <w:rFonts w:ascii="Consolas" w:hAnsi="Consolas"/>
-          <w:sz w:val="18"/>
-        </w:rPr>
-        <w:t>(Début)</w:t>
-        <w:br/>
-        <w:t xml:space="preserve">   |</w:t>
-        <w:br/>
-        <w:t>[Afficher « Couleur anneau 1 »] -&gt; /Saisir couleur1/</w:t>
-        <w:br/>
-        <w:t xml:space="preserve">   |</w:t>
-        <w:br/>
-        <w:t>[Afficher « Couleur anneau 2 »] -&gt; /Saisir couleur2/</w:t>
-        <w:br/>
-        <w:t xml:space="preserve">   |</w:t>
-        <w:br/>
-        <w:t>[Afficher « Couleur anneau 3 »] -&gt; /Saisir couleur3/</w:t>
-        <w:br/>
-        <w:t xml:space="preserve">   |</w:t>
-        <w:br/>
-        <w:t>[Afficher « Couleur anneau 4 »] -&gt; /Saisir couleur4/</w:t>
-        <w:br/>
-        <w:t xml:space="preserve">   |</w:t>
-        <w:br/>
-        <w:t>(Fin)</w:t>
+        <w:drawing>
+          <wp:inline xmlns:a="http://schemas.openxmlformats.org/drawingml/2006/main" xmlns:pic="http://schemas.openxmlformats.org/drawingml/2006/picture">
+            <wp:extent cx="4920673" cy="7920000"/>
+            <wp:docPr id="6" name="Picture 6"/>
+            <wp:cNvGraphicFramePr>
+              <a:graphicFrameLocks noChangeAspect="1"/>
+            </wp:cNvGraphicFramePr>
+            <a:graphic>
+              <a:graphicData uri="http://schemas.openxmlformats.org/drawingml/2006/picture">
+                <pic:pic>
+                  <pic:nvPicPr>
+                    <pic:cNvPr id="0" name="algo1.png"/>
+                    <pic:cNvPicPr/>
+                  </pic:nvPicPr>
+                  <pic:blipFill>
+                    <a:blip r:embed="rId14"/>
+                    <a:stretch>
+                      <a:fillRect/>
+                    </a:stretch>
+                  </pic:blipFill>
+                  <pic:spPr>
+                    <a:xfrm>
+                      <a:off x="0" y="0"/>
+                      <a:ext cx="4920673" cy="7920000"/>
+                    </a:xfrm>
+                    <a:prstGeom prst="rect"/>
+                  </pic:spPr>
+                </pic:pic>
+              </a:graphicData>
+            </a:graphic>
+          </wp:inline>
+        </w:drawing>
       </w:r>
     </w:p>
     <w:p>
@@ -243,6 +510,11 @@
       </w:r>
     </w:p>
     <w:p>
+      <w:r>
+        <w:br w:type="page"/>
+      </w:r>
+    </w:p>
+    <w:p>
       <w:pPr>
         <w:pStyle w:val="Heading1"/>
       </w:pPr>
@@ -252,46 +524,43 @@
     </w:p>
     <w:p>
       <w:r>
-        <w:t>Algorigramme (légende : (  ) début/fin, /  / entrée-sortie, [  ] traitement, &lt;  &gt; test, [[  ]] sous-programme) :</w:t>
+        <w:t>Algorigramme :</w:t>
       </w:r>
     </w:p>
     <w:p>
       <w:r>
-        <w:rPr>
-          <w:rFonts w:ascii="Consolas" w:hAnsi="Consolas"/>
-          <w:sz w:val="18"/>
-        </w:rPr>
-        <w:t>(Début)</w:t>
-        <w:br/>
-        <w:t xml:space="preserve">   |</w:t>
-        <w:br/>
-        <w:t>/Saisir couleur/</w:t>
-        <w:br/>
-        <w:t xml:space="preserve">   |</w:t>
-        <w:br/>
-        <w:t>&lt;couleur = noir ?&gt;  --oui--&gt; valeur = 0</w:t>
-        <w:br/>
-        <w:t xml:space="preserve">   | non</w:t>
-        <w:br/>
-        <w:t>&lt;couleur = marron ?&gt; --oui--&gt; valeur = 1</w:t>
-        <w:br/>
-        <w:t xml:space="preserve">   | non</w:t>
-        <w:br/>
-        <w:t xml:space="preserve">   ...  (rouge 2, orange 3, jaune 4, vert 5, bleu 6, violet 7, gris 8)</w:t>
-        <w:br/>
-        <w:t>&lt;couleur = blanc ?&gt; --oui--&gt; valeur = 9</w:t>
-        <w:br/>
-        <w:t xml:space="preserve">   | non</w:t>
-        <w:br/>
-        <w:t>valeur = -1 (couleur inconnue)</w:t>
-        <w:br/>
-        <w:t xml:space="preserve">   |</w:t>
-        <w:br/>
-        <w:t>/Afficher valeur/</w:t>
-        <w:br/>
-        <w:t xml:space="preserve">   |</w:t>
-        <w:br/>
-        <w:t>(Fin)</w:t>
+        <w:drawing>
+          <wp:inline xmlns:a="http://schemas.openxmlformats.org/drawingml/2006/main" xmlns:pic="http://schemas.openxmlformats.org/drawingml/2006/picture">
+            <wp:extent cx="3169581" cy="7920000"/>
+            <wp:docPr id="7" name="Picture 7"/>
+            <wp:cNvGraphicFramePr>
+              <a:graphicFrameLocks noChangeAspect="1"/>
+            </wp:cNvGraphicFramePr>
+            <a:graphic>
+              <a:graphicData uri="http://schemas.openxmlformats.org/drawingml/2006/picture">
+                <pic:pic>
+                  <pic:nvPicPr>
+                    <pic:cNvPr id="0" name="algo2.png"/>
+                    <pic:cNvPicPr/>
+                  </pic:nvPicPr>
+                  <pic:blipFill>
+                    <a:blip r:embed="rId15"/>
+                    <a:stretch>
+                      <a:fillRect/>
+                    </a:stretch>
+                  </pic:blipFill>
+                  <pic:spPr>
+                    <a:xfrm>
+                      <a:off x="0" y="0"/>
+                      <a:ext cx="3169581" cy="7920000"/>
+                    </a:xfrm>
+                    <a:prstGeom prst="rect"/>
+                  </pic:spPr>
+                </pic:pic>
+              </a:graphicData>
+            </a:graphic>
+          </wp:inline>
+        </w:drawing>
       </w:r>
     </w:p>
     <w:p>
@@ -365,6 +634,11 @@
       </w:r>
     </w:p>
     <w:p>
+      <w:r>
+        <w:br w:type="page"/>
+      </w:r>
+    </w:p>
+    <w:p>
       <w:pPr>
         <w:pStyle w:val="Heading1"/>
       </w:pPr>
@@ -374,44 +648,43 @@
     </w:p>
     <w:p>
       <w:r>
-        <w:t>Algorigramme (légende : (  ) début/fin, /  / entrée-sortie, [  ] traitement, &lt;  &gt; test, [[  ]] sous-programme) :</w:t>
+        <w:t>Algorigramme :</w:t>
       </w:r>
     </w:p>
     <w:p>
       <w:r>
-        <w:rPr>
-          <w:rFonts w:ascii="Consolas" w:hAnsi="Consolas"/>
-          <w:sz w:val="18"/>
-        </w:rPr>
-        <w:t>(Début)</w:t>
-        <w:br/>
-        <w:t xml:space="preserve">   |</w:t>
-        <w:br/>
-        <w:t>/Saisir couleur1, couleur2, couleur3/</w:t>
-        <w:br/>
-        <w:t xml:space="preserve">   |</w:t>
-        <w:br/>
-        <w:t>[[ v1 = valeur(couleur1) ]]  (sous-programme algorigramme 2)</w:t>
-        <w:br/>
-        <w:t>[[ v2 = valeur(couleur2) ]]</w:t>
-        <w:br/>
-        <w:t>[[ v3 = valeur(couleur3) ]]</w:t>
-        <w:br/>
-        <w:t xml:space="preserve">   |</w:t>
-        <w:br/>
-        <w:t>[X = v1 x 10 + v2]</w:t>
-        <w:br/>
-        <w:t>[Y = v3]</w:t>
-        <w:br/>
-        <w:t>[R = X x 10^Y]</w:t>
-        <w:br/>
-        <w:t xml:space="preserve">   |</w:t>
-        <w:br/>
-        <w:t>/Afficher R/</w:t>
-        <w:br/>
-        <w:t xml:space="preserve">   |</w:t>
-        <w:br/>
-        <w:t>(Fin)</w:t>
+        <w:drawing>
+          <wp:inline xmlns:a="http://schemas.openxmlformats.org/drawingml/2006/main" xmlns:pic="http://schemas.openxmlformats.org/drawingml/2006/picture">
+            <wp:extent cx="5226594" cy="7920000"/>
+            <wp:docPr id="8" name="Picture 8"/>
+            <wp:cNvGraphicFramePr>
+              <a:graphicFrameLocks noChangeAspect="1"/>
+            </wp:cNvGraphicFramePr>
+            <a:graphic>
+              <a:graphicData uri="http://schemas.openxmlformats.org/drawingml/2006/picture">
+                <pic:pic>
+                  <pic:nvPicPr>
+                    <pic:cNvPr id="0" name="algo3.png"/>
+                    <pic:cNvPicPr/>
+                  </pic:nvPicPr>
+                  <pic:blipFill>
+                    <a:blip r:embed="rId16"/>
+                    <a:stretch>
+                      <a:fillRect/>
+                    </a:stretch>
+                  </pic:blipFill>
+                  <pic:spPr>
+                    <a:xfrm>
+                      <a:off x="0" y="0"/>
+                      <a:ext cx="5226594" cy="7920000"/>
+                    </a:xfrm>
+                    <a:prstGeom prst="rect"/>
+                  </pic:spPr>
+                </pic:pic>
+              </a:graphicData>
+            </a:graphic>
+          </wp:inline>
+        </w:drawing>
       </w:r>
     </w:p>
     <w:p>
@@ -508,6 +781,11 @@
       </w:r>
     </w:p>
     <w:p>
+      <w:r>
+        <w:br w:type="page"/>
+      </w:r>
+    </w:p>
+    <w:p>
       <w:pPr>
         <w:pStyle w:val="Heading1"/>
       </w:pPr>
@@ -517,38 +795,84 @@
     </w:p>
     <w:p>
       <w:r>
-        <w:t>Algorigramme (légende : (  ) début/fin, /  / entrée-sortie, [  ] traitement, &lt;  &gt; test, [[  ]] sous-programme) :</w:t>
+        <w:t>Algorigramme :</w:t>
       </w:r>
     </w:p>
     <w:p>
       <w:r>
-        <w:rPr>
-          <w:rFonts w:ascii="Consolas" w:hAnsi="Consolas"/>
-          <w:sz w:val="18"/>
-        </w:rPr>
-        <w:t>(Début)</w:t>
-        <w:br/>
-        <w:t xml:space="preserve">   |</w:t>
-        <w:br/>
-        <w:t>[[ Saisir les 4 couleurs ]]  (sous-programme algorigramme 1)</w:t>
-        <w:br/>
-        <w:t xml:space="preserve">   |</w:t>
-        <w:br/>
-        <w:t>[[ R = valeur_resistance(c1, c2, c3) ]]  (sous-programme algorigramme 3)</w:t>
-        <w:br/>
-        <w:t xml:space="preserve">   |</w:t>
-        <w:br/>
-        <w:t>[[ T = tolérance(c4) ]]  (marron 1%, rouge 2%, vert 0,25%, bleu 0,2%,</w:t>
-        <w:br/>
-        <w:t xml:space="preserve">                          violet 0,1%, or 5%, argent 10%)</w:t>
-        <w:br/>
-        <w:t xml:space="preserve">   |</w:t>
-        <w:br/>
-        <w:t>/Afficher R et T/</w:t>
-        <w:br/>
-        <w:t xml:space="preserve">   |</w:t>
-        <w:br/>
-        <w:t>(Fin)</w:t>
+        <w:drawing>
+          <wp:inline xmlns:a="http://schemas.openxmlformats.org/drawingml/2006/main" xmlns:pic="http://schemas.openxmlformats.org/drawingml/2006/picture">
+            <wp:extent cx="4860036" cy="6551676"/>
+            <wp:docPr id="9" name="Picture 9"/>
+            <wp:cNvGraphicFramePr>
+              <a:graphicFrameLocks noChangeAspect="1"/>
+            </wp:cNvGraphicFramePr>
+            <a:graphic>
+              <a:graphicData uri="http://schemas.openxmlformats.org/drawingml/2006/picture">
+                <pic:pic>
+                  <pic:nvPicPr>
+                    <pic:cNvPr id="0" name="algo4.png"/>
+                    <pic:cNvPicPr/>
+                  </pic:nvPicPr>
+                  <pic:blipFill>
+                    <a:blip r:embed="rId17"/>
+                    <a:stretch>
+                      <a:fillRect/>
+                    </a:stretch>
+                  </pic:blipFill>
+                  <pic:spPr>
+                    <a:xfrm>
+                      <a:off x="0" y="0"/>
+                      <a:ext cx="4860036" cy="6551676"/>
+                    </a:xfrm>
+                    <a:prstGeom prst="rect"/>
+                  </pic:spPr>
+                </pic:pic>
+              </a:graphicData>
+            </a:graphic>
+          </wp:inline>
+        </w:drawing>
+      </w:r>
+    </w:p>
+    <w:p>
+      <w:r>
+        <w:t>Sous-programme tolérance (utilisé dans l'algorigramme 4) :</w:t>
+      </w:r>
+    </w:p>
+    <w:p>
+      <w:r>
+        <w:drawing>
+          <wp:inline xmlns:a="http://schemas.openxmlformats.org/drawingml/2006/main" xmlns:pic="http://schemas.openxmlformats.org/drawingml/2006/picture">
+            <wp:extent cx="4439662" cy="7920000"/>
+            <wp:docPr id="10" name="Picture 10"/>
+            <wp:cNvGraphicFramePr>
+              <a:graphicFrameLocks noChangeAspect="1"/>
+            </wp:cNvGraphicFramePr>
+            <a:graphic>
+              <a:graphicData uri="http://schemas.openxmlformats.org/drawingml/2006/picture">
+                <pic:pic>
+                  <pic:nvPicPr>
+                    <pic:cNvPr id="0" name="tolerance.png"/>
+                    <pic:cNvPicPr/>
+                  </pic:nvPicPr>
+                  <pic:blipFill>
+                    <a:blip r:embed="rId18"/>
+                    <a:stretch>
+                      <a:fillRect/>
+                    </a:stretch>
+                  </pic:blipFill>
+                  <pic:spPr>
+                    <a:xfrm>
+                      <a:off x="0" y="0"/>
+                      <a:ext cx="4439662" cy="7920000"/>
+                    </a:xfrm>
+                    <a:prstGeom prst="rect"/>
+                  </pic:spPr>
+                </pic:pic>
+              </a:graphicData>
+            </a:graphic>
+          </wp:inline>
+        </w:drawing>
       </w:r>
     </w:p>
     <w:p>

</xml_diff>